<commit_message>
Correct review evidence and regenerate project documents
</commit_message>
<xml_diff>
--- a/Revised Sprint 1 Deliverables/1. Revised Scope of Work.docx
+++ b/Revised Sprint 1 Deliverables/1. Revised Scope of Work.docx
@@ -76,7 +76,7 @@
         <w:t>1. The Scope of Work was never approved.</w:t>
       </w:r>
       <w:r>
-        <w:t xml:space="preserve"> It was submitted on 12 August. The client replied once, on 11 August, and has not responded since. We have continued without approval rather than stall, and have written to him again with our findings and a specific request.</w:t>
+        <w:t xml:space="preserve"> It was submitted on 12 August. The client replied once, on 11 August, and has not responded since. We have continued without approval rather than stall, and have drafted findings and a specific request. The repository does not establish that those drafts were sent.</w:t>
       </w:r>
     </w:p>
     <w:p>
@@ -87,13 +87,7 @@
         <w:t>2. Kaya remains inaccessible.</w:t>
       </w:r>
       <w:r>
-        <w:t xml:space="preserve"> The application requires a Principal Investigator, a data management plan, ORCIDs, a linked repository and an IRDS share. Adrian agreed to act as PI, which was the part we could not supply ourselves, but the remaining paperwork needs him and he has not been available. </w:t>
-      </w:r>
-      <w:r>
-        <w:rPr>
-          <w:b/>
-        </w:rPr>
-        <w:t>The team owns none of this dependency.</w:t>
+        <w:t xml:space="preserve"> The application requires a Principal Investigator, a data management plan, ORCIDs, a linked repository and an IRDS share. Adrian agreed to act as PI, which was the part we could not supply ourselves, but the remaining paperwork needs his involvement. The team still owns its ORCIDs, repository link and preparation of the information needed for the application; the remaining responsibilities must be confirmed rather than assigned entirely to the client.</w:t>
       </w:r>
     </w:p>
     <w:p>
@@ -130,6 +124,9 @@
     <w:p>
       <w:pPr>
         <w:pStyle w:val="ListNumber"/>
+        <w:numPr>
+          <w:numId w:val="10"/>
+        </w:numPr>
       </w:pPr>
       <w:r>
         <w:t>Three pairs, one dataset each, produced substantially more in three weeks.</w:t>
@@ -297,7 +294,10 @@
               <w:rPr>
                 <w:b/>
               </w:rPr>
-              <w:t>Met for all three datasets</w:t>
+              <w:t>Met for the available modalities.</w:t>
+            </w:r>
+            <w:r>
+              <w:t xml:space="preserve"> GOOSE's downloadable labelled data provides LiDAR, not radar</w:t>
             </w:r>
           </w:p>
         </w:tc>
@@ -458,10 +458,10 @@
               <w:rPr>
                 <w:b/>
               </w:rPr>
-              <w:t>Met for GOOSE</w:t>
+              <w:t>Partly met for GOOSE</w:t>
             </w:r>
             <w:r>
-              <w:t xml:space="preserve"> — client figure produced</w:t>
+              <w:t xml:space="preserve"> — figure produced; outside-pair cold read outstanding</w:t>
             </w:r>
           </w:p>
         </w:tc>
@@ -795,7 +795,7 @@
         <w:t>The epics are deferred, not abandoned.</w:t>
       </w:r>
       <w:r>
-        <w:t xml:space="preserve"> They resume in Sprint 3 once every pair has a working dataset. The mapping is preserved:</w:t>
+        <w:t xml:space="preserve"> Resuming them in Sprint 3 is proposed for the team checkpoint. The mapping is preserved:</w:t>
       </w:r>
     </w:p>
     <w:tbl>
@@ -1101,12 +1101,7 @@
         <w:t>`docs/metrics-definitions.md`</w:t>
       </w:r>
       <w:r>
-        <w:t xml:space="preserve"> — every metric defined before it is reported, with</w:t>
-      </w:r>
-    </w:p>
-    <w:p>
-      <w:r>
-        <w:t>rules on what mIoU averages over and why segmentation and detection metrics never share a table.</w:t>
+        <w:t xml:space="preserve"> — every metric defined before it is reported, with rules on what mIoU averages over and why segmentation and detection metrics never share a table.</w:t>
       </w:r>
     </w:p>
     <w:p>
@@ -1402,12 +1397,7 @@
         <w:t>Compute.</w:t>
       </w:r>
       <w:r>
-        <w:t xml:space="preserve"> Partly resolved. Risk R-08 assumed no member had a discrete NVIDIA GPU;</w:t>
-      </w:r>
-    </w:p>
-    <w:p>
-      <w:r>
-        <w:t xml:space="preserve">an audit on 27 August found a </w:t>
+        <w:t xml:space="preserve"> Partly resolved. Risk R-08 assumed no member had a discrete NVIDIA GPU; an audit on 27 August found a </w:t>
       </w:r>
       <w:r>
         <w:rPr>
@@ -1416,7 +1406,7 @@
         <w:t>GTX 1660, 6 GiB</w:t>
       </w:r>
       <w:r>
-        <w:t xml:space="preserve">, which is the team's only CUDA machine. It runs inference but a full GOOSE validation is </w:t>
+        <w:t xml:space="preserve">, which is the team's only CUDA machine. Bounded inference works with the documented runtime patch, FP32, FlashAttention off, patch sizes 64 and one augmentation. The ten-frame loop-body mean extrapolates to </w:t>
       </w:r>
       <w:r>
         <w:rPr>
@@ -1425,7 +1415,7 @@
         <w:t>~5 hours</w:t>
       </w:r>
       <w:r>
-        <w:t xml:space="preserve"> of sustained load, so it does not replace Kaya.</w:t>
+        <w:t>, excluding data loading; full-split resource use remains unmeasured. Further sustained local work requires Ricky's explicit approval.</w:t>
       </w:r>
     </w:p>
     <w:p>
@@ -1439,12 +1429,7 @@
         <w:t>Dataset access differs by dataset.</w:t>
       </w:r>
       <w:r>
-        <w:t xml:space="preserve"> GOOSE is open; TruckScenes is open via AWS;</w:t>
-      </w:r>
-    </w:p>
-    <w:p>
-      <w:r>
-        <w:t>TruckDrive requires accepting a non-commercial licence.</w:t>
+        <w:t xml:space="preserve"> GOOSE is open; TruckScenes is open via AWS; TruckDrive requires accepting a non-commercial licence.</w:t>
       </w:r>
     </w:p>
     <w:p>
@@ -1485,7 +1470,12 @@
     </w:p>
     <w:p>
       <w:r>
-        <w:t>D-01 to D-05 are carried forward from Sprint 1 and the decision log. New this revision:</w:t>
+        <w:t>D-01 to D-05 are carried forward from Sprint 1. D-06 to D-09 are recorded in</w:t>
+      </w:r>
+    </w:p>
+    <w:p>
+      <w:r>
+        <w:t>notification is not inferred from the existence of a draft note.</w:t>
       </w:r>
     </w:p>
     <w:p>
@@ -1496,7 +1486,7 @@
         <w:t>D-06 — STONE dropped.</w:t>
       </w:r>
       <w:r>
-        <w:t xml:space="preserve"> 29 August. The only off-road dataset found with annotated 4D imaging radar, but a 346 GB monolithic download with no sample split, no devkit in its repository, and maintainers unresponsive since March. Storage alone was necessary but not sufficient; the absent toolkit is what closed it. Reported to the client.</w:t>
+        <w:t xml:space="preserve"> 29 August. The only off-road dataset found with annotated 4D imaging radar, but a 346 GB monolithic download with no sample split, no devkit in its repository, and maintainers unresponsive since March. Storage alone was necessary but not sufficient; the absent toolkit was also a blocker. Client notification is not verified by the cited draft note.</w:t>
       </w:r>
     </w:p>
     <w:p>
@@ -1504,10 +1494,10 @@
         <w:rPr>
           <w:b/>
         </w:rPr>
-        <w:t>D-07 — Autoware deferred to Sprint 3.</w:t>
+        <w:t>D-07 — Proposed Autoware deferral to Sprint 3.</w:t>
       </w:r>
       <w:r>
-        <w:t xml:space="preserve"> It targets Ubuntu with ROS 2 and no team member currently runs Linux natively. GOOSE ships ROS bags natively, making it the cheapest entry point when the strand resumes — but they are </w:t>
+        <w:t xml:space="preserve"> Confirm the schedule at the team checkpoint. It targets Ubuntu with ROS 2 and no team member currently runs Linux natively. GOOSE ships ROS bags natively, making it the cheapest entry point when the strand resumes — but they are </w:t>
       </w:r>
       <w:r>
         <w:rPr>
@@ -1527,7 +1517,7 @@
         <w:t>D-08 — Delivery reorganised by dataset for Sprint 2.</w:t>
       </w:r>
       <w:r>
-        <w:t xml:space="preserve"> Epics resume in Sprint 3. See §4.2. Raised with the client in the 30 August note.</w:t>
+        <w:t xml:space="preserve"> Returning to epics in Sprint 3 is proposed for confirmation. See §4.2 and the dataset PRs cited in D-08; no sent-message evidence of this scope change is recorded.</w:t>
       </w:r>
     </w:p>
     <w:p>
@@ -1538,7 +1528,7 @@
         <w:t>D-09 — Work proceeds without client approval.</w:t>
       </w:r>
       <w:r>
-        <w:t xml:space="preserve"> Rather than stall, the team continued under the Sprint 1 scope as written, documented all variance, and wrote to the client with findings and a specific request. Recorded so the decision is visible rather than implied.</w:t>
+        <w:t xml:space="preserve"> Rather than stall, the team continued under the Sprint 1 scope as written and documented variance. A client note with findings and a specific request is drafted; notification remains unverified.</w:t>
       </w:r>
     </w:p>
     <w:p>
@@ -1551,7 +1541,17 @@
     </w:p>
     <w:p>
       <w:r>
-        <w:t>Evidence in the team repository. Every claim below is traceable to a merged pull request.</w:t>
+        <w:t xml:space="preserve">Evidence is in the team repository and its pull requests. GOOSE's bounded run (#17) and TruckDrive's exploration (#23) are merged. TruckScenes' exploration (#21) remains open; its evidence is reviewable but is not yet integrated into </w:t>
+      </w:r>
+      <w:r>
+        <w:rPr>
+          <w:rFonts w:ascii="Consolas" w:hAnsi="Consolas"/>
+          <w:color w:val="B03060"/>
+        </w:rPr>
+        <w:t>main</w:t>
+      </w:r>
+      <w:r>
+        <w:t>.</w:t>
       </w:r>
     </w:p>
     <w:p>
@@ -2079,7 +2079,7 @@
           <w:p>
             <w:r/>
             <w:r>
-              <w:t>Raised in writing; no response received</w:t>
+              <w:t>Drafted; notification not verified</w:t>
             </w:r>
           </w:p>
         </w:tc>
@@ -2090,7 +2090,7 @@
           <w:p>
             <w:r/>
             <w:r>
-              <w:t>Client unavailable since 11 August</w:t>
+              <w:t>Cited repository notes are proposals, not sent-message evidence</w:t>
             </w:r>
           </w:p>
         </w:tc>
@@ -2114,7 +2114,7 @@
         <w:t>at the time</w:t>
       </w:r>
       <w:r>
-        <w:t xml:space="preserve"> rather than after the fact. We have raised it in writing and cannot compel a reply. The attempt is documented in </w:t>
+        <w:t xml:space="preserve"> rather than after the fact. </w:t>
       </w:r>
       <w:r>
         <w:rPr>
@@ -2124,7 +2124,7 @@
         <w:t>client-notes/</w:t>
       </w:r>
       <w:r>
-        <w:t>, and this revision is the record.</w:t>
+        <w:t xml:space="preserve"> documents the proposed communication; it does not prove delivery. Record a dated sent communication before claiming that part of P-7 is satisfied.</w:t>
       </w:r>
     </w:p>
     <w:p>
@@ -2341,6 +2341,12 @@
   </w:num>
   <w:num w:numId="9">
     <w:abstractNumId w:val="0"/>
+  </w:num>
+  <w:num w:numId="10">
+    <w:abstractNumId w:val="7"/>
+    <w:lvlOverride w:ilvl="0">
+      <w:startOverride w:val="1"/>
+    </w:lvlOverride>
   </w:num>
 </w:numbering>
 </file>

</xml_diff>